<commit_message>
App documents fixed with current updated
</commit_message>
<xml_diff>
--- a/documents/App documents/Nexgenn_unblured/Van_Sale_User_Guide.docx
+++ b/documents/App documents/Nexgenn_unblured/Van_Sale_User_Guide.docx
@@ -97,7 +97,7 @@
           <w:sz w:val="24"/>
           <w:szCs w:val="24"/>
         </w:rPr>
-        <w:t xml:space="preserve">App version 1.4.0</w:t>
+        <w:t>App version 1.5.0</w:t>
       </w:r>
     </w:p>
     <w:p>
@@ -3979,6 +3979,321 @@
         <w:t xml:space="preserve">Tap a blue Tax chip to open the per-line tax breakdown.</w:t>
       </w:r>
     </w:p>
+    <w:p>
+      <w:pPr>
+        <w:pStyle w:val="ListParagraph"/>
+        <w:numPr>
+          <w:ilvl w:val="0"/>
+          <w:numId w:val="2"/>
+        </w:numPr>
+        <w:spacing w:after="40"/>
+      </w:pPr>
+      <w:r>
+        <w:rPr>
+          <w:rFonts w:ascii="Carlito" w:cs="Carlito" w:eastAsia="Carlito" w:hAnsi="Carlito"/>
+          <w:b w:val="false"/>
+          <w:bCs w:val="false"/>
+          <w:color w:val="33373D"/>
+          <w:sz w:val="22"/>
+          <w:szCs w:val="22"/>
+        </w:rPr>
+        <w:t>Tap the amber Due pill, or the Due chip on an open order, to see what the customer owed when that sale was made and which of their bills are still open.</w:t>
+      </w:r>
+    </w:p>
+    <w:tbl>
+      <w:tblPr>
+        <w:tblW w:type="dxa" w:w="9000"/>
+        <w:jc w:val="center"/>
+        <w:tblBorders>
+          <w:top w:val="single" w:color="auto" w:sz="4"/>
+          <w:left w:val="single" w:color="auto" w:sz="4"/>
+          <w:bottom w:val="single" w:color="auto" w:sz="4"/>
+          <w:right w:val="single" w:color="auto" w:sz="4"/>
+          <w:insideH w:val="single" w:color="auto" w:sz="4"/>
+          <w:insideV w:val="single" w:color="auto" w:sz="4"/>
+        </w:tblBorders>
+      </w:tblPr>
+      <w:tblGrid>
+        <w:gridCol w:w="9000"/>
+      </w:tblGrid>
+      <w:tr>
+        <w:trPr>
+          <w:cantSplit/>
+        </w:trPr>
+        <w:tc>
+          <w:tcPr>
+            <w:tcW w:type="dxa" w:w="9000"/>
+            <w:tcBorders>
+              <w:top w:val="single" w:color="D3DDEA" w:sz="6"/>
+              <w:left w:val="single" w:color="D3DDEA" w:sz="6"/>
+              <w:bottom w:val="single" w:color="D3DDEA" w:sz="6"/>
+              <w:right w:val="single" w:color="D3DDEA" w:sz="6"/>
+            </w:tcBorders>
+            <w:shd w:fill="F7FAFD" w:color="auto" w:val="clear"/>
+            <w:tcMar>
+              <w:top w:type="dxa" w:w="120"/>
+              <w:left w:type="dxa" w:w="120"/>
+              <w:bottom w:type="dxa" w:w="120"/>
+              <w:right w:type="dxa" w:w="120"/>
+            </w:tcMar>
+          </w:tcPr>
+          <w:p>
+            <w:pPr>
+              <w:spacing w:after="80"/>
+              <w:jc w:val="center"/>
+            </w:pPr>
+            <w:r>
+              <w:drawing>
+                <wp:inline xmlns:a="http://schemas.openxmlformats.org/drawingml/2006/main" xmlns:pic="http://schemas.openxmlformats.org/drawingml/2006/picture">
+                  <wp:extent cx="2212848" cy="3326648"/>
+                  <wp:docPr id="2" name="Picture 2"/>
+                  <wp:cNvGraphicFramePr>
+                    <a:graphicFrameLocks noChangeAspect="1"/>
+                  </wp:cNvGraphicFramePr>
+                  <a:graphic>
+                    <a:graphicData uri="http://schemas.openxmlformats.org/drawingml/2006/picture">
+                      <pic:pic>
+                        <pic:nvPicPr>
+                          <pic:cNvPr id="0" name="44-orders-due-pill.jpg"/>
+                          <pic:cNvPicPr/>
+                        </pic:nvPicPr>
+                        <pic:blipFill>
+                          <a:blip r:embed="rId38"/>
+                          <a:stretch>
+                            <a:fillRect/>
+                          </a:stretch>
+                        </pic:blipFill>
+                        <pic:spPr>
+                          <a:xfrm>
+                            <a:off x="0" y="0"/>
+                            <a:ext cx="2212848" cy="3326648"/>
+                          </a:xfrm>
+                          <a:prstGeom prst="rect"/>
+                        </pic:spPr>
+                      </pic:pic>
+                    </a:graphicData>
+                  </a:graphic>
+                </wp:inline>
+              </w:drawing>
+            </w:r>
+          </w:p>
+          <w:p>
+            <w:pPr>
+              <w:jc w:val="center"/>
+            </w:pPr>
+            <w:r>
+              <w:rPr>
+                <w:rFonts w:ascii="Carlito" w:cs="Carlito" w:eastAsia="Carlito" w:hAnsi="Carlito"/>
+                <w:b w:val="false"/>
+                <w:bCs w:val="false"/>
+                <w:i/>
+                <w:iCs/>
+                <w:color w:val="6D7A8C"/>
+                <w:sz w:val="19"/>
+                <w:szCs w:val="19"/>
+              </w:rPr>
+              <w:t>The Orders list — an amber Due pill shows what each customer still owes.</w:t>
+            </w:r>
+          </w:p>
+        </w:tc>
+      </w:tr>
+    </w:tbl>
+    <w:tbl>
+      <w:tblPr>
+        <w:tblW w:type="dxa" w:w="9000"/>
+        <w:jc w:val="center"/>
+        <w:tblBorders>
+          <w:top w:val="single" w:color="auto" w:sz="4"/>
+          <w:left w:val="single" w:color="auto" w:sz="4"/>
+          <w:bottom w:val="single" w:color="auto" w:sz="4"/>
+          <w:right w:val="single" w:color="auto" w:sz="4"/>
+          <w:insideH w:val="single" w:color="auto" w:sz="4"/>
+          <w:insideV w:val="single" w:color="auto" w:sz="4"/>
+        </w:tblBorders>
+      </w:tblPr>
+      <w:tblGrid>
+        <w:gridCol w:w="9000"/>
+      </w:tblGrid>
+      <w:tr>
+        <w:trPr>
+          <w:cantSplit/>
+        </w:trPr>
+        <w:tc>
+          <w:tcPr>
+            <w:tcW w:type="dxa" w:w="9000"/>
+            <w:tcBorders>
+              <w:top w:val="single" w:color="D3DDEA" w:sz="6"/>
+              <w:left w:val="single" w:color="D3DDEA" w:sz="6"/>
+              <w:bottom w:val="single" w:color="D3DDEA" w:sz="6"/>
+              <w:right w:val="single" w:color="D3DDEA" w:sz="6"/>
+            </w:tcBorders>
+            <w:shd w:fill="F7FAFD" w:color="auto" w:val="clear"/>
+            <w:tcMar>
+              <w:top w:type="dxa" w:w="120"/>
+              <w:left w:type="dxa" w:w="120"/>
+              <w:bottom w:type="dxa" w:w="120"/>
+              <w:right w:type="dxa" w:w="120"/>
+            </w:tcMar>
+          </w:tcPr>
+          <w:p>
+            <w:pPr>
+              <w:spacing w:after="80"/>
+              <w:jc w:val="center"/>
+            </w:pPr>
+            <w:r>
+              <w:drawing>
+                <wp:inline xmlns:a="http://schemas.openxmlformats.org/drawingml/2006/main" xmlns:pic="http://schemas.openxmlformats.org/drawingml/2006/picture">
+                  <wp:extent cx="2212848" cy="3326648"/>
+                  <wp:docPr id="3" name="Picture 3"/>
+                  <wp:cNvGraphicFramePr>
+                    <a:graphicFrameLocks noChangeAspect="1"/>
+                  </wp:cNvGraphicFramePr>
+                  <a:graphic>
+                    <a:graphicData uri="http://schemas.openxmlformats.org/drawingml/2006/picture">
+                      <pic:pic>
+                        <pic:nvPicPr>
+                          <pic:cNvPr id="0" name="45-order-customer-due.jpg"/>
+                          <pic:cNvPicPr/>
+                        </pic:nvPicPr>
+                        <pic:blipFill>
+                          <a:blip r:embed="rId39"/>
+                          <a:stretch>
+                            <a:fillRect/>
+                          </a:stretch>
+                        </pic:blipFill>
+                        <pic:spPr>
+                          <a:xfrm>
+                            <a:off x="0" y="0"/>
+                            <a:ext cx="2212848" cy="3326648"/>
+                          </a:xfrm>
+                          <a:prstGeom prst="rect"/>
+                        </pic:spPr>
+                      </pic:pic>
+                    </a:graphicData>
+                  </a:graphic>
+                </wp:inline>
+              </w:drawing>
+            </w:r>
+          </w:p>
+          <w:p>
+            <w:pPr>
+              <w:jc w:val="center"/>
+            </w:pPr>
+            <w:r>
+              <w:rPr>
+                <w:rFonts w:ascii="Carlito" w:cs="Carlito" w:eastAsia="Carlito" w:hAnsi="Carlito"/>
+                <w:b w:val="false"/>
+                <w:bCs w:val="false"/>
+                <w:i/>
+                <w:iCs/>
+                <w:color w:val="6D7A8C"/>
+                <w:sz w:val="19"/>
+                <w:szCs w:val="19"/>
+              </w:rPr>
+              <w:t>An open order — the CUSTOMER DUE card and the Due chip in the action row.</w:t>
+            </w:r>
+          </w:p>
+        </w:tc>
+      </w:tr>
+    </w:tbl>
+    <w:tbl>
+      <w:tblPr>
+        <w:tblW w:type="dxa" w:w="9000"/>
+        <w:jc w:val="center"/>
+        <w:tblBorders>
+          <w:top w:val="single" w:color="auto" w:sz="4"/>
+          <w:left w:val="single" w:color="auto" w:sz="4"/>
+          <w:bottom w:val="single" w:color="auto" w:sz="4"/>
+          <w:right w:val="single" w:color="auto" w:sz="4"/>
+          <w:insideH w:val="single" w:color="auto" w:sz="4"/>
+          <w:insideV w:val="single" w:color="auto" w:sz="4"/>
+        </w:tblBorders>
+      </w:tblPr>
+      <w:tblGrid>
+        <w:gridCol w:w="9000"/>
+      </w:tblGrid>
+      <w:tr>
+        <w:trPr>
+          <w:cantSplit/>
+        </w:trPr>
+        <w:tc>
+          <w:tcPr>
+            <w:tcW w:type="dxa" w:w="9000"/>
+            <w:tcBorders>
+              <w:top w:val="single" w:color="D3DDEA" w:sz="6"/>
+              <w:left w:val="single" w:color="D3DDEA" w:sz="6"/>
+              <w:bottom w:val="single" w:color="D3DDEA" w:sz="6"/>
+              <w:right w:val="single" w:color="D3DDEA" w:sz="6"/>
+            </w:tcBorders>
+            <w:shd w:fill="F7FAFD" w:color="auto" w:val="clear"/>
+            <w:tcMar>
+              <w:top w:type="dxa" w:w="120"/>
+              <w:left w:type="dxa" w:w="120"/>
+              <w:bottom w:type="dxa" w:w="120"/>
+              <w:right w:type="dxa" w:w="120"/>
+            </w:tcMar>
+          </w:tcPr>
+          <w:p>
+            <w:pPr>
+              <w:spacing w:after="80"/>
+              <w:jc w:val="center"/>
+            </w:pPr>
+            <w:r>
+              <w:drawing>
+                <wp:inline xmlns:a="http://schemas.openxmlformats.org/drawingml/2006/main" xmlns:pic="http://schemas.openxmlformats.org/drawingml/2006/picture">
+                  <wp:extent cx="2212848" cy="3326648"/>
+                  <wp:docPr id="4" name="Picture 4"/>
+                  <wp:cNvGraphicFramePr>
+                    <a:graphicFrameLocks noChangeAspect="1"/>
+                  </wp:cNvGraphicFramePr>
+                  <a:graphic>
+                    <a:graphicData uri="http://schemas.openxmlformats.org/drawingml/2006/picture">
+                      <pic:pic>
+                        <pic:nvPicPr>
+                          <pic:cNvPr id="0" name="46-due-breakdown.jpg"/>
+                          <pic:cNvPicPr/>
+                        </pic:nvPicPr>
+                        <pic:blipFill>
+                          <a:blip r:embed="rId40"/>
+                          <a:stretch>
+                            <a:fillRect/>
+                          </a:stretch>
+                        </pic:blipFill>
+                        <pic:spPr>
+                          <a:xfrm>
+                            <a:off x="0" y="0"/>
+                            <a:ext cx="2212848" cy="3326648"/>
+                          </a:xfrm>
+                          <a:prstGeom prst="rect"/>
+                        </pic:spPr>
+                      </pic:pic>
+                    </a:graphicData>
+                  </a:graphic>
+                </wp:inline>
+              </w:drawing>
+            </w:r>
+          </w:p>
+          <w:p>
+            <w:pPr>
+              <w:jc w:val="center"/>
+            </w:pPr>
+            <w:r>
+              <w:rPr>
+                <w:rFonts w:ascii="Carlito" w:cs="Carlito" w:eastAsia="Carlito" w:hAnsi="Carlito"/>
+                <w:b w:val="false"/>
+                <w:bCs w:val="false"/>
+                <w:i/>
+                <w:iCs/>
+                <w:color w:val="6D7A8C"/>
+                <w:sz w:val="19"/>
+                <w:szCs w:val="19"/>
+              </w:rPr>
+              <w:t>The Customer Due box — what was owed on the day, and the bills open today.</w:t>
+            </w:r>
+          </w:p>
+        </w:tc>
+      </w:tr>
+    </w:tbl>
     <w:p>
       <w:pPr>
         <w:keepNext/>

</xml_diff>